<commit_message>
Update fitness market analysis outputs and reports
- Revised scenario predictions with updated price estimates for three scenarios.
- Adjusted standardized effects to reflect new analysis results for LAFitnessLocations.
- Updated summary statistics for MembershipPrice to reflect new mean and median values.
- Modified EDA and predictions reports to incorporate changes in pricing methodology and analysis.
- Added county centroids data for improved distance calculations in pricing estimates.
- Enhanced fitness market analysis script to utilize inverse-distance weighting for counties without local offers.
</commit_message>
<xml_diff>
--- a/HW Week 1 and 2/reports/Florida_Fitness_Market_EDA_Report.docx
+++ b/HW Week 1 and 2/reports/Florida_Fitness_Market_EDA_Report.docx
@@ -149,7 +149,7 @@
           </w:tcPr>
           <w:p>
             <w:r>
-              <w:t>Critical limitation: MembershipPrice uses official advertised recurring offers where locally available (32 counties) and a statewide median estimate for 35 counties without a local public rate. It is not a transaction-price survey; plan terms, promotions, and franchise differences limit comparability.</w:t>
+              <w:t>Critical limitation: MembershipPrice uses official advertised recurring offers where locally available (32 counties) and nearby-county estimates for 35 counties without a local public rate. It is not a transaction-price survey; entry-plan terms, promotions, initiation/annual fees, and franchise differences limit comparability.</w:t>
             </w:r>
           </w:p>
         </w:tc>
@@ -666,7 +666,7 @@
           </w:tcPr>
           <w:p>
             <w:r>
-              <w:t>$49.66</w:t>
+              <w:t>$57.12</w:t>
             </w:r>
           </w:p>
         </w:tc>
@@ -683,7 +683,7 @@
           </w:tcPr>
           <w:p>
             <w:r>
-              <w:t>$43.99</w:t>
+              <w:t>$59.55</w:t>
             </w:r>
           </w:p>
         </w:tc>
@@ -700,7 +700,7 @@
           </w:tcPr>
           <w:p>
             <w:r>
-              <w:t>$10.97</w:t>
+              <w:t>$11.57</w:t>
             </w:r>
           </w:p>
         </w:tc>
@@ -1651,7 +1651,7 @@
         <w:pStyle w:val="ListBullet"/>
       </w:pPr>
       <w:r>
-        <w:t>PopulationDensity: r = 0.180 (positive).</w:t>
+        <w:t>PopulationDensity: r = -0.160 (negative).</w:t>
       </w:r>
     </w:p>
     <w:p>
@@ -1659,7 +1659,7 @@
         <w:pStyle w:val="ListBullet"/>
       </w:pPr>
       <w:r>
-        <w:t>LAFitnessLocations: r = -0.060 (negative).</w:t>
+        <w:t>LAFitnessLocations: r = -0.324 (negative; strongest absolute association).</w:t>
       </w:r>
     </w:p>
     <w:p>
@@ -1667,7 +1667,7 @@
         <w:pStyle w:val="ListBullet"/>
       </w:pPr>
       <w:r>
-        <w:t>CompetitorLocations: r = 0.033 (positive).</w:t>
+        <w:t>CompetitorLocations: r = -0.303 (negative).</w:t>
       </w:r>
     </w:p>
     <w:p>
@@ -1675,7 +1675,7 @@
         <w:pStyle w:val="ListBullet"/>
       </w:pPr>
       <w:r>
-        <w:t>CountyPopulation: r = 0.086 (positive).</w:t>
+        <w:t>CountyPopulation: r = -0.262 (negative).</w:t>
       </w:r>
     </w:p>
     <w:p>
@@ -1683,7 +1683,7 @@
         <w:pStyle w:val="ListBullet"/>
       </w:pPr>
       <w:r>
-        <w:t>MedianHouseholdIncome: r = 0.371 (positive and strongest).</w:t>
+        <w:t>MedianHouseholdIncome: r = 0.051 (positive).</w:t>
       </w:r>
     </w:p>
     <w:p>
@@ -1691,7 +1691,7 @@
         <w:pStyle w:val="ListBullet"/>
       </w:pPr>
       <w:r>
-        <w:t>AvgGymRating: r = 0.157 (positive).</w:t>
+        <w:t>AvgGymRating: r = 0.059 (positive).</w:t>
       </w:r>
     </w:p>
     <w:p>
@@ -1737,7 +1737,7 @@
         <w:pStyle w:val="ListBullet"/>
       </w:pPr>
       <w:r>
-        <w:t>Influence diagnostics flagged Polk County, Pasco County, Charlotte County, Miami-Dade County. These counties deserve sensitivity review; a flag does not mean the data are wrong.</w:t>
+        <w:t>Influence diagnostics flagged Charlotte County, DeSoto County, Highlands County. These counties deserve sensitivity review; a flag does not mean the data are wrong.</w:t>
       </w:r>
     </w:p>
     <w:p>
@@ -1761,7 +1761,7 @@
         <w:pStyle w:val="ListNumber"/>
       </w:pPr>
       <w:r>
-        <w:t>The county price target is based on official recurring advertised offers in 32 counties; the remaining 35 counties use a transparent statewide median estimate because no local public rate was available. No predictor-based or random synthetic price formula is used.</w:t>
+        <w:t>The county price target is based on official recurring advertised offers in 32 counties; the remaining 35 counties use inverse-distance weighted estimates from the three nearest counties with observed local offers. The mean source distance is 53.0 miles and the maximum is 124.3 miles. No predictor-based or random synthetic price formula is used.</w:t>
       </w:r>
     </w:p>
     <w:p>
@@ -1777,7 +1777,7 @@
         <w:pStyle w:val="ListNumber"/>
       </w:pPr>
       <w:r>
-        <w:t>Business use requires broader comparable local price coverage, a refreshed Places pull, and direct validation of candidate trade areas.</w:t>
+        <w:t>Business use requires normalized comparable plan terms, broader local price coverage, a refreshed Places pull, and direct validation of candidate trade areas.</w:t>
       </w:r>
     </w:p>
     <w:p>

</xml_diff>